<commit_message>
Replace Solution Architecture with the diagram from the PPT deck
Swaps the generic four-layer description under Solution Architecture
for the actual Smart MES solution architecture diagram used in
"Gates India MES Implementation_SCIL_R0.pptx" (also present in the
companion R0 PDF), extracted as an image and embedded inline.

Rewrites the surrounding paragraphs to walk through the diagram's own
three tiers (MOM Server, IT/OT Integration, Machines) and label them
exactly as shown: Smart MES, Smart Reports, MES Database/Datawarehouse,
Smart Integrator, OPC Server, MOM Clients (PC/IPC, PDA/Scanner,
Printer), and the OEM SCADA vs. PLC-only machine paths, plus the ERP
and 3rd party (AGV/ASRS) connections via Smart Integrator.

Verified: OOXML schema validation passes against the original; the
image relationship and inline drawing resolve correctly under
python-docx.

Co-Authored-By: Claude <noreply@anthropic.com>
Claude-Session: https://claude.ai/code/session_01EA4TuxRy8J2gXjqdwKiAky
</commit_message>
<xml_diff>
--- a/R4_CustomerName_Location_ProjectTitle_OfferNo_Technical Offer_Revision.docx
+++ b/R4_CustomerName_Location_ProjectTitle_OfferNo_Technical Offer_Revision.docx
@@ -7522,402 +7522,49 @@
           <w:sz w:val="22"/>
           <w:szCs w:val="22"/>
         </w:rPr>
-        <w:t xml:space="preserve">The proposed solution is deployed as a layered architecture in which the MES application sits between the plant control layer and the enterprise layer, and communicates with each through defined interfaces. The layers and their role in the solution are summarised below.</w:t>
-      </w:r>
-    </w:p>
-    <w:tbl>
-      <w:tblPr>
-        <w:tblStyle w:val="SCILCorporateTable10"/>
-        <w:tblW w:w="9439" w:type="dxa"/>
-        <w:tblLayout w:type="fixed"/>
-        <w:tblLook w:val="04A0" w:firstRow="1" w:lastRow="0" w:firstColumn="1" w:lastColumn="0" w:noHBand="0" w:noVBand="1"/>
-      </w:tblPr>
-      <w:tblGrid>
-        <w:gridCol w:w="1985"/>
-        <w:gridCol w:w="3119"/>
-        <w:gridCol w:w="4335"/>
-      </w:tblGrid>
-      <w:tr>
-        <w:trPr>
-          <w:cnfStyle w:val="100000000000" w:firstRow="1" w:lastRow="0" w:firstColumn="0" w:lastColumn="0" w:oddVBand="0" w:evenVBand="0" w:oddHBand="0" w:evenHBand="0" w:firstRowFirstColumn="0" w:firstRowLastColumn="0" w:lastRowFirstColumn="0" w:lastRowLastColumn="0"/>
-          <w:tblHeader/>
-        </w:trPr>
-        <w:tc>
-          <w:tcPr>
-            <w:tcW w:w="1985" w:type="dxa"/>
-          </w:tcPr>
-          <w:p>
-            <w:pPr>
-              <w:pStyle w:val="TableHeading"/>
-              <w:rPr>
-                <w:rFonts w:asciiTheme="minorHAnsi" w:hAnsiTheme="minorHAnsi" w:cstheme="minorHAnsi"/>
-                <w:sz w:val="22"/>
-                <w:szCs w:val="22"/>
-              </w:rPr>
-            </w:pPr>
-            <w:r>
-              <w:rPr>
-                <w:rFonts w:asciiTheme="minorHAnsi" w:hAnsiTheme="minorHAnsi" w:cstheme="minorHAnsi"/>
-                <w:sz w:val="22"/>
-                <w:szCs w:val="22"/>
-              </w:rPr>
-              <w:t xml:space="preserve">Layer</w:t>
-            </w:r>
-          </w:p>
-        </w:tc>
-        <w:tc>
-          <w:tcPr>
-            <w:tcW w:w="3119" w:type="dxa"/>
-          </w:tcPr>
-          <w:p>
-            <w:pPr>
-              <w:pStyle w:val="TableHeading"/>
-              <w:rPr>
-                <w:rFonts w:asciiTheme="minorHAnsi" w:hAnsiTheme="minorHAnsi" w:cstheme="minorHAnsi"/>
-                <w:sz w:val="22"/>
-                <w:szCs w:val="22"/>
-              </w:rPr>
-            </w:pPr>
-            <w:r>
-              <w:rPr>
-                <w:rFonts w:asciiTheme="minorHAnsi" w:hAnsiTheme="minorHAnsi" w:cstheme="minorHAnsi"/>
-                <w:sz w:val="22"/>
-                <w:szCs w:val="22"/>
-              </w:rPr>
-              <w:t xml:space="preserve">Elements</w:t>
-            </w:r>
-          </w:p>
-        </w:tc>
-        <w:tc>
-          <w:tcPr>
-            <w:tcW w:w="4335" w:type="dxa"/>
-          </w:tcPr>
-          <w:p>
-            <w:pPr>
-              <w:pStyle w:val="TableHeading"/>
-              <w:rPr>
-                <w:rFonts w:asciiTheme="minorHAnsi" w:hAnsiTheme="minorHAnsi" w:cstheme="minorHAnsi"/>
-                <w:sz w:val="22"/>
-                <w:szCs w:val="22"/>
-              </w:rPr>
-            </w:pPr>
-            <w:r>
-              <w:rPr>
-                <w:rFonts w:asciiTheme="minorHAnsi" w:hAnsiTheme="minorHAnsi" w:cstheme="minorHAnsi"/>
-                <w:sz w:val="22"/>
-                <w:szCs w:val="22"/>
-              </w:rPr>
-              <w:t xml:space="preserve">Role in the solution</w:t>
-            </w:r>
-          </w:p>
-        </w:tc>
-      </w:tr>
-      <w:tr>
-        <w:tc>
-          <w:tcPr>
-            <w:tcW w:w="1985" w:type="dxa"/>
-          </w:tcPr>
-          <w:p>
-            <w:pPr>
-              <w:pStyle w:val="TableText"/>
-              <w:rPr>
-                <w:rFonts w:asciiTheme="minorHAnsi" w:hAnsiTheme="minorHAnsi" w:cstheme="minorHAnsi"/>
-                <w:sz w:val="22"/>
-                <w:szCs w:val="22"/>
-              </w:rPr>
-            </w:pPr>
-            <w:r>
-              <w:rPr>
-                <w:rFonts w:asciiTheme="minorHAnsi" w:hAnsiTheme="minorHAnsi" w:cstheme="minorHAnsi"/>
-                <w:sz w:val="22"/>
-                <w:szCs w:val="22"/>
-              </w:rPr>
-              <w:t xml:space="preserve">Enterprise Layer</w:t>
-            </w:r>
-          </w:p>
-        </w:tc>
-        <w:tc>
-          <w:tcPr>
-            <w:tcW w:w="3119" w:type="dxa"/>
-          </w:tcPr>
-          <w:p>
-            <w:pPr>
-              <w:pStyle w:val="TableText"/>
-              <w:rPr>
-                <w:rFonts w:asciiTheme="minorHAnsi" w:hAnsiTheme="minorHAnsi" w:cstheme="minorHAnsi"/>
-                <w:sz w:val="22"/>
-                <w:szCs w:val="22"/>
-              </w:rPr>
-            </w:pPr>
-            <w:r>
-              <w:rPr>
-                <w:rFonts w:asciiTheme="minorHAnsi" w:hAnsiTheme="minorHAnsi" w:cstheme="minorHAnsi"/>
-                <w:sz w:val="22"/>
-                <w:szCs w:val="22"/>
-              </w:rPr>
-              <w:t xml:space="preserve">Oracle ERP</w:t>
-            </w:r>
-          </w:p>
-        </w:tc>
-        <w:tc>
-          <w:tcPr>
-            <w:tcW w:w="4335" w:type="dxa"/>
-          </w:tcPr>
-          <w:p>
-            <w:pPr>
-              <w:pStyle w:val="TableText"/>
-              <w:rPr>
-                <w:rFonts w:asciiTheme="minorHAnsi" w:hAnsiTheme="minorHAnsi" w:cstheme="minorHAnsi"/>
-                <w:sz w:val="22"/>
-                <w:szCs w:val="22"/>
-              </w:rPr>
-            </w:pPr>
-            <w:r>
-              <w:rPr>
-                <w:rFonts w:asciiTheme="minorHAnsi" w:hAnsiTheme="minorHAnsi" w:cstheme="minorHAnsi"/>
-                <w:sz w:val="22"/>
-                <w:szCs w:val="22"/>
-              </w:rPr>
-              <w:t xml:space="preserve">System of record for material master data and material movement requisitions; receives consumption and production confirmation from MES.</w:t>
-            </w:r>
-          </w:p>
-        </w:tc>
-      </w:tr>
-      <w:tr>
-        <w:tc>
-          <w:tcPr>
-            <w:tcW w:w="1985" w:type="dxa"/>
-          </w:tcPr>
-          <w:p>
-            <w:pPr>
-              <w:pStyle w:val="TableText"/>
-              <w:rPr>
-                <w:rFonts w:asciiTheme="minorHAnsi" w:hAnsiTheme="minorHAnsi" w:cstheme="minorHAnsi"/>
-                <w:sz w:val="22"/>
-                <w:szCs w:val="22"/>
-              </w:rPr>
-            </w:pPr>
-            <w:r>
-              <w:rPr>
-                <w:rFonts w:asciiTheme="minorHAnsi" w:hAnsiTheme="minorHAnsi" w:cstheme="minorHAnsi"/>
-                <w:sz w:val="22"/>
-                <w:szCs w:val="22"/>
-              </w:rPr>
-              <w:t xml:space="preserve">Application Layer</w:t>
-            </w:r>
-          </w:p>
-        </w:tc>
-        <w:tc>
-          <w:tcPr>
-            <w:tcW w:w="3119" w:type="dxa"/>
-          </w:tcPr>
-          <w:p>
-            <w:pPr>
-              <w:pStyle w:val="TableText"/>
-              <w:rPr>
-                <w:rFonts w:asciiTheme="minorHAnsi" w:hAnsiTheme="minorHAnsi" w:cstheme="minorHAnsi"/>
-                <w:sz w:val="22"/>
-                <w:szCs w:val="22"/>
-              </w:rPr>
-            </w:pPr>
-            <w:r>
-              <w:rPr>
-                <w:rFonts w:asciiTheme="minorHAnsi" w:hAnsiTheme="minorHAnsi" w:cstheme="minorHAnsi"/>
-                <w:sz w:val="22"/>
-                <w:szCs w:val="22"/>
-              </w:rPr>
-              <w:t xml:space="preserve">MES application server, database server, QA environment</w:t>
-            </w:r>
-          </w:p>
-        </w:tc>
-        <w:tc>
-          <w:tcPr>
-            <w:tcW w:w="4335" w:type="dxa"/>
-          </w:tcPr>
-          <w:p>
-            <w:pPr>
-              <w:pStyle w:val="TableText"/>
-              <w:rPr>
-                <w:rFonts w:asciiTheme="minorHAnsi" w:hAnsiTheme="minorHAnsi" w:cstheme="minorHAnsi"/>
-                <w:sz w:val="22"/>
-                <w:szCs w:val="22"/>
-              </w:rPr>
-            </w:pPr>
-            <w:r>
-              <w:rPr>
-                <w:rFonts w:asciiTheme="minorHAnsi" w:hAnsiTheme="minorHAnsi" w:cstheme="minorHAnsi"/>
-                <w:sz w:val="22"/>
-                <w:szCs w:val="22"/>
-              </w:rPr>
-              <w:t xml:space="preserve">Item and BOM management, material validation, traceability and genealogy, reporting and dashboards.</w:t>
-            </w:r>
-          </w:p>
-        </w:tc>
-      </w:tr>
-      <w:tr>
-        <w:tc>
-          <w:tcPr>
-            <w:tcW w:w="1985" w:type="dxa"/>
-          </w:tcPr>
-          <w:p>
-            <w:pPr>
-              <w:pStyle w:val="TableText"/>
-              <w:rPr>
-                <w:rFonts w:asciiTheme="minorHAnsi" w:hAnsiTheme="minorHAnsi" w:cstheme="minorHAnsi"/>
-                <w:sz w:val="22"/>
-                <w:szCs w:val="22"/>
-              </w:rPr>
-            </w:pPr>
-            <w:r>
-              <w:rPr>
-                <w:rFonts w:asciiTheme="minorHAnsi" w:hAnsiTheme="minorHAnsi" w:cstheme="minorHAnsi"/>
-                <w:sz w:val="22"/>
-                <w:szCs w:val="22"/>
-              </w:rPr>
-              <w:t xml:space="preserve">Control Layer</w:t>
-            </w:r>
-          </w:p>
-        </w:tc>
-        <w:tc>
-          <w:tcPr>
-            <w:tcW w:w="3119" w:type="dxa"/>
-          </w:tcPr>
-          <w:p>
-            <w:pPr>
-              <w:pStyle w:val="TableText"/>
-              <w:rPr>
-                <w:rFonts w:asciiTheme="minorHAnsi" w:hAnsiTheme="minorHAnsi" w:cstheme="minorHAnsi"/>
-                <w:sz w:val="22"/>
-                <w:szCs w:val="22"/>
-              </w:rPr>
-            </w:pPr>
-            <w:r>
-              <w:rPr>
-                <w:rFonts w:asciiTheme="minorHAnsi" w:hAnsiTheme="minorHAnsi" w:cstheme="minorHAnsi"/>
-                <w:sz w:val="22"/>
-                <w:szCs w:val="22"/>
-              </w:rPr>
-              <w:t xml:space="preserve">Machine PLCs; WinCC SCADA (Auto Chemical); mixer SCADA</w:t>
-            </w:r>
-          </w:p>
-        </w:tc>
-        <w:tc>
-          <w:tcPr>
-            <w:tcW w:w="4335" w:type="dxa"/>
-          </w:tcPr>
-          <w:p>
-            <w:pPr>
-              <w:pStyle w:val="TableText"/>
-              <w:rPr>
-                <w:rFonts w:asciiTheme="minorHAnsi" w:hAnsiTheme="minorHAnsi" w:cstheme="minorHAnsi"/>
-                <w:sz w:val="22"/>
-                <w:szCs w:val="22"/>
-              </w:rPr>
-            </w:pPr>
-            <w:r>
-              <w:rPr>
-                <w:rFonts w:asciiTheme="minorHAnsi" w:hAnsiTheme="minorHAnsi" w:cstheme="minorHAnsi"/>
-                <w:sz w:val="22"/>
-                <w:szCs w:val="22"/>
-              </w:rPr>
-              <w:t xml:space="preserve">Supplies plan, recipe, batch and consumption signals to MES and receives interlock commands such as bin locking and oil door release.</w:t>
-            </w:r>
-          </w:p>
-        </w:tc>
-      </w:tr>
-      <w:tr>
-        <w:tc>
-          <w:tcPr>
-            <w:tcW w:w="1985" w:type="dxa"/>
-          </w:tcPr>
-          <w:p>
-            <w:pPr>
-              <w:pStyle w:val="TableText"/>
-              <w:rPr>
-                <w:rFonts w:asciiTheme="minorHAnsi" w:hAnsiTheme="minorHAnsi" w:cstheme="minorHAnsi"/>
-                <w:sz w:val="22"/>
-                <w:szCs w:val="22"/>
-              </w:rPr>
-            </w:pPr>
-            <w:r>
-              <w:rPr>
-                <w:rFonts w:asciiTheme="minorHAnsi" w:hAnsiTheme="minorHAnsi" w:cstheme="minorHAnsi"/>
-                <w:sz w:val="22"/>
-                <w:szCs w:val="22"/>
-              </w:rPr>
-              <w:t xml:space="preserve">Field Layer</w:t>
-            </w:r>
-          </w:p>
-        </w:tc>
-        <w:tc>
-          <w:tcPr>
-            <w:tcW w:w="3119" w:type="dxa"/>
-          </w:tcPr>
-          <w:p>
-            <w:pPr>
-              <w:pStyle w:val="TableText"/>
-              <w:rPr>
-                <w:rFonts w:asciiTheme="minorHAnsi" w:hAnsiTheme="minorHAnsi" w:cstheme="minorHAnsi"/>
-                <w:sz w:val="22"/>
-                <w:szCs w:val="22"/>
-              </w:rPr>
-            </w:pPr>
-            <w:r>
-              <w:rPr>
-                <w:rFonts w:asciiTheme="minorHAnsi" w:hAnsiTheme="minorHAnsi" w:cstheme="minorHAnsi"/>
-                <w:sz w:val="22"/>
-                <w:szCs w:val="22"/>
-              </w:rPr>
-              <w:t xml:space="preserve">HMIs, BT scanners, Wi-Fi mobile scanners, stack lights, label printers, metallic QR tags</w:t>
-            </w:r>
-          </w:p>
-        </w:tc>
-        <w:tc>
-          <w:tcPr>
-            <w:tcW w:w="4335" w:type="dxa"/>
-          </w:tcPr>
-          <w:p>
-            <w:pPr>
-              <w:pStyle w:val="TableText"/>
-              <w:rPr>
-                <w:rFonts w:asciiTheme="minorHAnsi" w:hAnsiTheme="minorHAnsi" w:cstheme="minorHAnsi"/>
-                <w:sz w:val="22"/>
-                <w:szCs w:val="22"/>
-              </w:rPr>
-            </w:pPr>
-            <w:r>
-              <w:rPr>
-                <w:rFonts w:asciiTheme="minorHAnsi" w:hAnsiTheme="minorHAnsi" w:cstheme="minorHAnsi"/>
-                <w:sz w:val="22"/>
-                <w:szCs w:val="22"/>
-              </w:rPr>
-              <w:t xml:space="preserve">Operator guidance and confirmation, lot scanning, visual pass/fail feedback and label printing at the point of use.</w:t>
-            </w:r>
-          </w:p>
-        </w:tc>
-      </w:tr>
-    </w:tbl>
-    <w:p>
-      <w:pPr>
-        <w:spacing w:after="0"/>
-      </w:pPr>
+        <w:t xml:space="preserve">Smart MES is deployed as a three tier architecture, shown below, connecting the shop floor machines to the MOM server through an IT/OT integration layer, and exposing the resulting data to MOM clients and to third party applications.</w:t>
+      </w:r>
     </w:p>
     <w:p>
       <w:pPr>
-        <w:spacing w:after="120"/>
-        <w:rPr>
-          <w:rFonts w:asciiTheme="minorHAnsi" w:hAnsiTheme="minorHAnsi" w:cstheme="minorHAnsi"/>
-          <w:sz w:val="22"/>
-          <w:szCs w:val="22"/>
-        </w:rPr>
-      </w:pPr>
-      <w:r>
-        <w:rPr>
-          <w:rFonts w:asciiTheme="minorHAnsi" w:hAnsiTheme="minorHAnsi" w:cstheme="minorHAnsi"/>
-          <w:sz w:val="22"/>
-          <w:szCs w:val="22"/>
-        </w:rPr>
-        <w:t xml:space="preserve">At the enterprise layer, Oracle ERP remains the system of record for material master data and material movement requisitions. MES fetches this data at defined intervals and returns consumption and production confirmations. Any change or customisation required within ERP to support these interfaces remains in Customer scope.</w:t>
+        <w:spacing w:before="120" w:after="120"/>
+        <w:jc w:val="center"/>
+      </w:pPr>
+      <w:r>
+        <w:drawing>
+          <wp:inline distT="0" distB="0" distL="0" distR="0">
+            <wp:extent cx="5852160" cy="2617378"/>
+            <wp:docPr id="901" name="arch_diagram"/>
+            <wp:cNvGraphicFramePr>
+              <a:graphicFrameLocks xmlns:a="http://schemas.openxmlformats.org/drawingml/2006/main" noChangeAspect="1"/>
+            </wp:cNvGraphicFramePr>
+            <a:graphic xmlns:a="http://schemas.openxmlformats.org/drawingml/2006/main">
+              <a:graphicData uri="http://schemas.openxmlformats.org/drawingml/2006/picture">
+                <pic:pic xmlns:pic="http://schemas.openxmlformats.org/drawingml/2006/picture">
+                  <pic:nvPicPr>
+                    <pic:cNvPr id="901" name="arch_diagram"/>
+                    <pic:cNvPicPr/>
+                  </pic:nvPicPr>
+                  <pic:blipFill>
+                    <a:blip r:embed="rId24"/>
+                    <a:stretch>
+                      <a:fillRect/>
+                    </a:stretch>
+                  </pic:blipFill>
+                  <pic:spPr>
+                    <a:xfrm>
+                      <a:off x="0" y="0"/>
+                      <a:ext cx="5852160" cy="2617378"/>
+                    </a:xfrm>
+                    <a:prstGeom prst="rect">
+                      <a:avLst/>
+                    </a:prstGeom>
+                  </pic:spPr>
+                </pic:pic>
+              </a:graphicData>
+            </a:graphic>
+          </wp:inline>
+        </w:drawing>
       </w:r>
     </w:p>
     <w:p>
@@ -7935,7 +7582,7 @@
           <w:sz w:val="22"/>
           <w:szCs w:val="22"/>
         </w:rPr>
-        <w:t xml:space="preserve">At the application layer, the MES application server hosts the item and BOM management, validation, traceability and reporting modules, with a dedicated database server holding master, transactional and genealogy data. A separate QA environment mirrors production for testing and acceptance.</w:t>
+        <w:t xml:space="preserve">At the MOM Server tier, Smart MES holds the application logic and reads and writes the MES Database and MES Datawarehouse; Smart Reports serves dashboards and reports off the same data.</w:t>
       </w:r>
     </w:p>
     <w:p>
@@ -7953,7 +7600,7 @@
           <w:sz w:val="22"/>
           <w:szCs w:val="22"/>
         </w:rPr>
-        <w:t xml:space="preserve">At the control layer, MES interfaces with the machine PLCs, and with WinCC SCADA in the Auto Chemical area, to receive plan, recipe, batch and consumption signals, and to drive interlocks such as feeder bin locking and oil door release. Where a machine does not expose the required signals, MES falls back to operator confirmation at the HMI and to BOM based consumption logging.</w:t>
+        <w:t xml:space="preserve">At the IT/OT Integration tier, Smart Integrator brokers data between Smart MES and the plant floor, and the OPC Server provides a standard interface to the machine control systems. Smart Integrator also connects outward to the ERP and to third party applications such as AGV and ASRS through defined interfaces.</w:t>
       </w:r>
     </w:p>
     <w:p>
@@ -7971,7 +7618,7 @@
           <w:sz w:val="22"/>
           <w:szCs w:val="22"/>
         </w:rPr>
-        <w:t xml:space="preserve">At the field layer, operators interact with the system through HMIs, Bluetooth and Wi-Fi QR scanners, stack lights and label printers positioned as per the Bill Of Material. Feeders, bins and trolleys are identified by metallic QR tags.</w:t>
+        <w:t xml:space="preserve">At the Machines tier, machines with an OEM SCADA are read through that SCADA and, where present, directly through their PLC; machines without an OEM SCADA are read directly through their PLC via the OPC Server. Auto Chemical is read through its WinCC SCADA in this manner; all other areas connect through PLC.</w:t>
       </w:r>
     </w:p>
     <w:p>
@@ -7989,7 +7636,25 @@
           <w:sz w:val="22"/>
           <w:szCs w:val="22"/>
         </w:rPr>
-        <w:t xml:space="preserve">The detailed solution architecture diagram, including the final interface list, will be prepared during the Functional Design Session and issued as part of the FDS and ICD.</w:t>
+        <w:t xml:space="preserve">MOM Clients, namely PC/IPC, PDA/Scanner and Printer devices, connect to Smart MES for operator interaction, scanning and label printing at each station listed under Machine Details.</w:t>
+      </w:r>
+    </w:p>
+    <w:p>
+      <w:pPr>
+        <w:spacing w:after="120"/>
+        <w:rPr>
+          <w:rFonts w:asciiTheme="minorHAnsi" w:hAnsiTheme="minorHAnsi" w:cstheme="minorHAnsi"/>
+          <w:sz w:val="22"/>
+          <w:szCs w:val="22"/>
+        </w:rPr>
+      </w:pPr>
+      <w:r>
+        <w:rPr>
+          <w:rFonts w:asciiTheme="minorHAnsi" w:hAnsiTheme="minorHAnsi" w:cstheme="minorHAnsi"/>
+          <w:sz w:val="22"/>
+          <w:szCs w:val="22"/>
+        </w:rPr>
+        <w:t xml:space="preserve">This architecture and the final interface list will be confirmed during the Functional Design Session and issued as part of the FDS and ICD.</w:t>
       </w:r>
     </w:p>
     <w:p/>

</xml_diff>